<commit_message>
Make learner evidence persistence durable
</commit_message>
<xml_diff>
--- a/backend/docs/LearnerOS_Backend_Architecture.docx
+++ b/backend/docs/LearnerOS_Backend_Architecture.docx
@@ -247,15 +247,8 @@
             <w:pPr>
               <w:spacing w:after="0" w:line="252" w:lineRule="auto"/>
             </w:pPr>
-            <w:r/>
             <w:r>
-              <w:rPr>
-                <w:rFonts w:ascii="Aptos" w:hAnsi="Aptos"/>
-                <w:b w:val="0"/>
-                <w:color w:val="243B53"/>
-                <w:sz w:val="16"/>
-              </w:rPr>
-              <w:t>2026-08-10</w:t>
+              <w:t>2026-08-14</w:t>
             </w:r>
           </w:p>
         </w:tc>
@@ -317,7 +310,7 @@
               <w:spacing w:after="0" w:line="252" w:lineRule="auto"/>
             </w:pPr>
             <w:r>
-              <w:t>Code-grounded implementation reference; assessment behavior updated after the subsection/concept-scope changes</w:t>
+              <w:t>Code-grounded implementation reference updated for Fireworks-only routing, constrained MCQs, durable insight convergence, and privacy-safe telemetry</w:t>
             </w:r>
           </w:p>
         </w:tc>
@@ -531,7 +524,7 @@
     </w:p>
     <w:p>
       <w:r>
-        <w:t>The backend is a FastAPI service backed by Neo4j. LLM calls use OpenAI-compatible clients for Fireworks, Cerebras, and Gemini. Firebase Authentication supplies identity and role claims. OpenTelemetry is optional and exports traces and metrics through OTLP when enabled. The service is deployed as a single Uvicorn process on Fly.io with a health check on port 8000.</w:t>
+        <w:t>The backend is a FastAPI service backed by Neo4j. All generation, evaluation, tutoring, and embedding calls use OpenAI-compatible Fireworks endpoints; image/handwriting evaluation uses a separate Fireworks vision model. Firebase Authentication supplies identity and role claims. OpenTelemetry is optional and exports traces and metrics through OTLP when enabled. The service is deployed as a single Uvicorn process on Fly.io with a health check on port 8000.</w:t>
       </w:r>
     </w:p>
     <w:p>
@@ -1311,15 +1304,8 @@
             <w:pPr>
               <w:spacing w:after="0" w:line="252" w:lineRule="auto"/>
             </w:pPr>
-            <w:r/>
             <w:r>
-              <w:rPr>
-                <w:rFonts w:ascii="Aptos" w:hAnsi="Aptos"/>
-                <w:b w:val="0"/>
-                <w:color w:val="243B53"/>
-                <w:sz w:val="15"/>
-              </w:rPr>
-              <w:t>Neo4j writes for attempts, insights, conversations, embeddings, and clusters</w:t>
+              <w:t>Assessment Attempt queueing plus durable LearnerEvidenceJob creation in one Neo4j write; indexed token/lease claims coordinate workers, while the module owns recovery, idempotent insight writes, dead letters, cache invalidation, and atomic result counters</w:t>
             </w:r>
           </w:p>
         </w:tc>
@@ -1345,15 +1331,8 @@
             <w:pPr>
               <w:spacing w:after="0" w:line="252" w:lineRule="auto"/>
             </w:pPr>
-            <w:r/>
             <w:r>
-              <w:rPr>
-                <w:rFonts w:ascii="Aptos" w:hAnsi="Aptos"/>
-                <w:b w:val="0"/>
-                <w:color w:val="243B53"/>
-                <w:sz w:val="15"/>
-              </w:rPr>
-              <w:t>Assessment persistence is designed to be non-fatal to learner-facing evaluation; failures are recorded in telemetry</w:t>
+              <w:t>The learner-facing evaluation remains successful when asynchronous persistence fails; queued and unaccounted jobs recover after restarts, while terminal failures remain observable</w:t>
             </w:r>
           </w:p>
         </w:tc>
@@ -2274,15 +2253,8 @@
             <w:pPr>
               <w:spacing w:after="0" w:line="252" w:lineRule="auto"/>
             </w:pPr>
-            <w:r/>
             <w:r>
-              <w:rPr>
-                <w:rFonts w:ascii="Aptos" w:hAnsi="Aptos"/>
-                <w:b w:val="0"/>
-                <w:color w:val="243B53"/>
-                <w:sz w:val="15"/>
-              </w:rPr>
-              <w:t>GET /api/sections/{id}/test/question; /test/mcq; POST .../evaluate</w:t>
+              <w:t>GET /api/sections/{id}/test/question; /test/mcq; POST .../evaluate; GET /api/assessment-attempts/{assessment_id}/status</w:t>
             </w:r>
           </w:p>
         </w:tc>
@@ -2309,7 +2281,7 @@
               <w:spacing w:after="0" w:line="252" w:lineRule="auto"/>
             </w:pPr>
             <w:r>
-              <w:t>Target-subsection question/MCQ generation; personalized evaluation with validated insight scope</w:t>
+              <w:t>Target-subsection generation and evaluation; learner-owned status polling for background insight reconciliation</w:t>
             </w:r>
           </w:p>
         </w:tc>
@@ -4699,7 +4671,7 @@
         <w:pStyle w:val="ListBullet"/>
       </w:pPr>
       <w:r>
-        <w:t>Assessment persistence is queued/attempted outside the critical learner response path. A persistence failure is observable and should not make a successful model evaluation look like a model failure.</w:t>
+        <w:t>Assessment Execution transactionally creates durable Neo4j LearnerEvidenceJob records before reporting evidence as queued. Indexed lock-before-predicate claims issue one worker a token and lease; the deep module recovers expired or unaccounted jobs and owns reconciliation, embedding, idempotent insight writes, dead letters, cache invalidation, and atomic Assessment Attempt accounting.</w:t>
       </w:r>
     </w:p>
     <w:p>
@@ -4712,7 +4684,7 @@
     </w:p>
     <w:p>
       <w:r>
-        <w:t>Insights are student-specific evidence attached to curriculum concepts and sources. The active state is a query projection over historical evidence, not a replacement for historical records. The written-answer and MCQ flows are: resolve target subsection -&gt; evaluate against subsection content -&gt; select valid concept candidates -&gt; validate structured evidence -&gt; insight creation -&gt; reconciliation -&gt; embedding -&gt; persistence.</w:t>
+        <w:t>Learner Evidence is student-specific and attached to curriculum concepts and sources. Current Learner State is a projection over historical evidence. Assessment Execution validates evidence, then leased LearnerEvidenceJob processing owns reconciliation, embedding, idempotent graph persistence, supersession, recovery, cache invalidation, dead-letter recording, and attempt completion accounting.</w:t>
       </w:r>
     </w:p>
     <w:p>
@@ -4766,19 +4738,19 @@
             <w:r>
               <w:t>Student answer</w:t>
               <w:br/>
-              <w:t xml:space="preserve">  -&gt; resolve and validate the requested subsection inside the section</w:t>
+              <w:t xml:space="preserve">  -&gt; Assessment Execution resolves context, evaluates, and validates Learner Evidence</w:t>
               <w:br/>
-              <w:t xml:space="preserve">  -&gt; evaluate against target subsection content; full section is reference context only</w:t>
+              <w:t xml:space="preserve">  -&gt; module transactionally records durable LearnerEvidenceJob work before returning queued</w:t>
               <w:br/>
-              <w:t xml:space="preserve">  -&gt; use direct section concepts, or chapter concepts when the section has none</w:t>
+              <w:t xml:space="preserve">  -&gt; one worker acquires an indexed claim token and lease through the stable interface</w:t>
               <w:br/>
-              <w:t xml:space="preserve">  -&gt; reject insight IDs outside the resolved candidate set</w:t>
+              <w:t xml:space="preserve">  -&gt; module reconciles the same student + source + concept key</w:t>
               <w:br/>
-              <w:t xml:space="preserve">  -&gt; attach accepted evidence to the target subsection/source and concept</w:t>
+              <w:t xml:space="preserve">  -&gt; module embeds and persists the new active insight with supersession history</w:t>
               <w:br/>
-              <w:t xml:space="preserve">  -&gt; reconcile against active insight(s) for the same student + source/concept key</w:t>
+              <w:t xml:space="preserve">  -&gt; module invalidates derived views and atomically completes the job plus attempt counters</w:t>
               <w:br/>
-              <w:t xml:space="preserve">  -&gt; preserve history, embed the active insight, and retrieve it later for teaching/tutor context</w:t>
+              <w:t xml:space="preserve">  -&gt; UI polls the learner-owned attempt until terminal and reloads Current Learner State</w:t>
             </w:r>
           </w:p>
         </w:tc>
@@ -5465,7 +5437,7 @@
     </w:p>
     <w:p>
       <w:r>
-        <w:t>backend/app/services/llm.py provides one provider-neutral LLMService. It uses the OpenAI Python SDK against OpenAI-compatible endpoints and caches clients by provider and purpose. Provider selection is explicit for most production paths and can be configured through environment variables.</w:t>
+        <w:t>backend/app/services/llm.py provides the shared Fireworks LLMService. It uses the OpenAI Python SDK against the Fireworks-compatible endpoint and caches clients by purpose. The Nemotron text model has thinking disabled for predictable structured output; the Fireworks vision and embedding models remain separate.</w:t>
       </w:r>
     </w:p>
     <w:tbl>
@@ -5989,13 +5961,7 @@
         <w:rPr>
           <w:b/>
         </w:rPr>
-        <w:t xml:space="preserve">Content capture: </w:t>
-      </w:r>
-      <w:r>
-        <w:rPr>
-          <w:b w:val="0"/>
-        </w:rPr>
-        <w:t>prompt/response/image content is fingerprinted or hidden in telemetry by default; full content capture requires OTEL_CAPTURE_CONTENT=true.</w:t>
+        <w:t>Content capture: prompt/response/image content is represented by fingerprints, sizes, and bounded metadata. LLM failure spans/logs record error type and provider status only, not raw exception messages or tracebacks that may echo learner content. OTEL_CAPTURE_CONTENT remains false by default.</w:t>
       </w:r>
     </w:p>
     <w:p>
@@ -6210,7 +6176,7 @@
               <w:spacing w:after="0" w:line="252" w:lineRule="auto"/>
             </w:pPr>
             <w:r>
-              <w:t>Non-personalized and share-cache eligible; requested subsection ID is authoritative</w:t>
+              <w:t>Non-personalized and share-cache eligible; requested subsection ID is authoritative; MCQs require exact A-D options through JSON Schema and a 1,200-token completion cap</w:t>
             </w:r>
           </w:p>
         </w:tc>
@@ -6362,14 +6328,7 @@
             <w:pPr>
               <w:spacing w:after="0" w:line="252" w:lineRule="auto"/>
             </w:pPr>
-            <w:r/>
             <w:r>
-              <w:rPr>
-                <w:rFonts w:ascii="Aptos" w:hAnsi="Aptos"/>
-                <w:b w:val="0"/>
-                <w:color w:val="243B53"/>
-                <w:sz w:val="15"/>
-              </w:rPr>
               <w:t>Exercise question plus text or image input and chapter prerequisite concept context</w:t>
             </w:r>
           </w:p>
@@ -6396,15 +6355,8 @@
             <w:pPr>
               <w:spacing w:after="0" w:line="252" w:lineRule="auto"/>
             </w:pPr>
-            <w:r/>
             <w:r>
-              <w:rPr>
-                <w:rFonts w:ascii="Aptos" w:hAnsi="Aptos"/>
-                <w:b w:val="0"/>
-                <w:color w:val="243B53"/>
-                <w:sz w:val="15"/>
-              </w:rPr>
-              <w:t>Personalized; Gemini 3.1 Pro Preview path</w:t>
+              <w:t>Personalized; text uses the Fireworks text model and image/handwriting uses the Fireworks vision model</w:t>
             </w:r>
           </w:p>
         </w:tc>
@@ -7818,15 +7770,8 @@
             <w:pPr>
               <w:spacing w:after="0" w:line="252" w:lineRule="auto"/>
             </w:pPr>
-            <w:r/>
             <w:r>
-              <w:rPr>
-                <w:rFonts w:ascii="Aptos" w:hAnsi="Aptos"/>
-                <w:b w:val="0"/>
-                <w:color w:val="243B53"/>
-                <w:sz w:val="15"/>
-              </w:rPr>
-              <w:t>In-memory TTL/cache helper; public read headers are set by curriculum routes</w:t>
+              <w:t>In-memory TTL/cache helper for public curriculum reads; the authenticated current-subsection insight projection deliberately bypasses process-local caching</w:t>
             </w:r>
           </w:p>
         </w:tc>
@@ -10636,7 +10581,7 @@
               <w:spacing w:after="0" w:line="252" w:lineRule="auto"/>
             </w:pPr>
             <w:r>
-              <w:t>Force source_id to the validated target subsection</w:t>
+              <w:t>Force source_id to the validated target subsection, then submit Learner Evidence through the stable persistence interface</w:t>
             </w:r>
           </w:p>
         </w:tc>
@@ -10663,7 +10608,7 @@
               <w:spacing w:after="0" w:line="252" w:lineRule="auto"/>
             </w:pPr>
             <w:r>
-              <w:t>Persist only accepted concept links; unauthenticated or empty-insight cases are skipped without changing the evaluation result</w:t>
+              <w:t>One deep module owns reconciliation, embedding, Neo4j persistence, retries, dead letters, cache invalidation, attempt accounting, and terminal convergence</w:t>
             </w:r>
           </w:p>
         </w:tc>
@@ -10777,11 +10722,11 @@
               <w:br/>
               <w:t>a section with no valid concepts evaluates successfully with empty insights</w:t>
               <w:br/>
-              <w:t>MCQ evaluation accepts an insight from the declared chapter-fallback scope</w:t>
+              <w:t>MCQs require a JSON-schema-constrained object with exactly A-D options and bounded output</w:t>
               <w:br/>
-              <w:t>the curriculum concept route does not shadow the /test namespace</w:t>
+              <w:t>assessment status is scoped through Student-[:SUBMITTED]-&gt;AssessmentAttempt ownership</w:t>
               <w:br/>
-              <w:t>verified locally: 7 focused tests passed</w:t>
+              <w:t>current subsection insights are read from Neo4j after terminal persistence status</w:t>
             </w:r>
           </w:p>
         </w:tc>
@@ -11148,7 +11093,7 @@
               <w:spacing w:after="0" w:line="252" w:lineRule="auto"/>
             </w:pPr>
             <w:r>
-              <w:t>Custom llm.&lt;operation&gt; spans record provider, model, operation, input/output sizes, fingerprints, image count, latency, token usage when available, fallbacks, retries, and exceptions</w:t>
+              <w:t>Custom llm.&lt;operation&gt; spans record provider, model, operation, sizes, fingerprints, image count, latency, token usage, fallbacks, and retries. Failure spans export only error type and provider status.</w:t>
             </w:r>
           </w:p>
         </w:tc>
@@ -11175,7 +11120,7 @@
               <w:spacing w:after="0" w:line="252" w:lineRule="auto"/>
             </w:pPr>
             <w:r>
-              <w:t>Separates model latency and provider failure from the surrounding route</w:t>
+              <w:t>Separates provider latency and failure without exporting raw SDK exception text that may contain echoed learner content</w:t>
             </w:r>
           </w:p>
         </w:tc>
@@ -11320,7 +11265,7 @@
               <w:spacing w:after="0" w:line="252" w:lineRule="auto"/>
             </w:pPr>
             <w:r>
-              <w:t>assessment.lifecycle log events and span events use scalar attributes; the active span receives assessment.id and assessment.status</w:t>
+              <w:t>Assessment Execution and Learner Evidence persistence emit lifecycle events through the same assessment ID; persistence stages remain internal to the deep module</w:t>
             </w:r>
           </w:p>
         </w:tc>
@@ -11347,7 +11292,7 @@
               <w:spacing w:after="0" w:line="252" w:lineRule="auto"/>
             </w:pPr>
             <w:r>
-              <w:t>One assessment can be followed through synchronous evaluation and background insight persistence</w:t>
+              <w:t>One assessment can be followed across synchronous evaluation and the complete background Current Learner State convergence path</w:t>
             </w:r>
           </w:p>
         </w:tc>
@@ -11694,14 +11639,7 @@
               </w:rPr>
               <w:t>Privacy boundary</w:t>
               <w:br/>
-            </w:r>
-            <w:r>
-              <w:rPr>
-                <w:b w:val="0"/>
-                <w:color w:val="243B53"/>
-                <w:sz w:val="17"/>
-              </w:rPr>
-              <w:t>Structured assessment logs may still include operational identifiers such as section, concept, source, insight, and assessment IDs. Metric labels intentionally exclude high-cardinality student, concept, and assessment identifiers. Durable AssessmentAttempt records can contain question and text-answer content for authenticated students; image answers are represented by SHA-256 hashes rather than image data.</w:t>
+              <w:t>Structured assessment logs retain bounded operational identifiers for correlation. Metrics exclude high-cardinality learner, concept, and assessment identifiers. LLM failures are sanitized to error type/status. Durable AssessmentAttempt records can contain question and text-answer content for authenticated students; image answers retain only SHA-256 hashes and counts.</w:t>
             </w:r>
           </w:p>
         </w:tc>
@@ -12656,15 +12594,8 @@
             <w:pPr>
               <w:spacing w:after="0" w:line="252" w:lineRule="auto"/>
             </w:pPr>
-            <w:r/>
             <w:r>
-              <w:rPr>
-                <w:rFonts w:ascii="Aptos" w:hAnsi="Aptos"/>
-                <w:b w:val="0"/>
-                <w:color w:val="243B53"/>
-                <w:sz w:val="15"/>
-              </w:rPr>
-              <w:t>GEMINI_API_KEY, FIREWORKS_API_KEY, FIREWORKS_API_KEY_EMBEDDINGS, CEREBRAS_API_KEY plus base URLs/models</w:t>
+              <w:t>FIREWORKS_API_KEY, FIREWORKS_API_KEY_EMBEDDINGS, FIREWORKS_BASE_URL, FIREWORKS_MODEL, FIREWORKS_VISION_MODEL, FIREWORKS_EMBEDDING_MODEL</w:t>
             </w:r>
           </w:p>
         </w:tc>
@@ -12690,15 +12621,8 @@
             <w:pPr>
               <w:spacing w:after="0" w:line="252" w:lineRule="auto"/>
             </w:pPr>
-            <w:r/>
             <w:r>
-              <w:rPr>
-                <w:rFonts w:ascii="Aptos" w:hAnsi="Aptos"/>
-                <w:b w:val="0"/>
-                <w:color w:val="243B53"/>
-                <w:sz w:val="15"/>
-              </w:rPr>
-              <w:t>Generation, evaluation, and embeddings</w:t>
+              <w:t>Fireworks text/JSON generation, evaluation, tutoring, image/handwriting evaluation, and embeddings</w:t>
             </w:r>
           </w:p>
         </w:tc>
@@ -13784,15 +13708,8 @@
             <w:pPr>
               <w:spacing w:after="0" w:line="252" w:lineRule="auto"/>
             </w:pPr>
-            <w:r/>
             <w:r>
-              <w:rPr>
-                <w:rFonts w:ascii="Aptos" w:hAnsi="Aptos"/>
-                <w:b w:val="0"/>
-                <w:color w:val="243B53"/>
-                <w:sz w:val="15"/>
-              </w:rPr>
-              <w:t>Generation cache</w:t>
+              <w:t>Current learner insight reads</w:t>
             </w:r>
           </w:p>
         </w:tc>
@@ -13818,15 +13735,8 @@
             <w:pPr>
               <w:spacing w:after="0" w:line="252" w:lineRule="auto"/>
             </w:pPr>
-            <w:r/>
             <w:r>
-              <w:rPr>
-                <w:rFonts w:ascii="Aptos" w:hAnsi="Aptos"/>
-                <w:b w:val="0"/>
-                <w:color w:val="243B53"/>
-                <w:sz w:val="15"/>
-              </w:rPr>
-              <w:t>In-memory cache is per Fly machine; Upstash is optional</w:t>
+              <w:t>Current-subsection projections bypass the process-local cache; assessment completion is polled for at most two minutes</w:t>
             </w:r>
           </w:p>
         </w:tc>
@@ -13852,15 +13762,8 @@
             <w:pPr>
               <w:spacing w:after="0" w:line="252" w:lineRule="auto"/>
             </w:pPr>
-            <w:r/>
             <w:r>
-              <w:rPr>
-                <w:rFonts w:ascii="Aptos" w:hAnsi="Aptos"/>
-                <w:b w:val="0"/>
-                <w:color w:val="243B53"/>
-                <w:sz w:val="15"/>
-              </w:rPr>
-              <w:t>Multiple machines can have cold local caches; shared hit rate depends on Upstash configuration</w:t>
+              <w:t>Correct cross-worker convergence favors Neo4j reads over the former 20-second stale-cache window; timeout/failure is visible to the learner</w:t>
             </w:r>
           </w:p>
         </w:tc>
@@ -14083,214 +13986,6 @@
                 <w:color w:val="243B53"/>
                 <w:sz w:val="15"/>
               </w:rPr>
-              <w:t>Teacher/admin roles</w:t>
-            </w:r>
-          </w:p>
-        </w:tc>
-        <w:tc>
-          <w:tcPr>
-            <w:tcW w:type="dxa" w:w="4464"/>
-            <w:shd w:fill="FFFFFF"/>
-            <w:tcBorders>
-              <w:top w:val="single" w:sz="3" w:color="D9E2EC"/>
-              <w:left w:val="single" w:sz="3" w:color="D9E2EC"/>
-              <w:bottom w:val="single" w:sz="3" w:color="D9E2EC"/>
-              <w:right w:val="single" w:sz="3" w:color="D9E2EC"/>
-            </w:tcBorders>
-            <w:vAlign w:val="top"/>
-            <w:tcMar>
-              <w:top w:w="90" w:type="dxa"/>
-              <w:start w:w="100" w:type="dxa"/>
-              <w:bottom w:w="90" w:type="dxa"/>
-              <w:end w:w="100" w:type="dxa"/>
-            </w:tcMar>
-          </w:tcPr>
-          <w:p>
-            <w:pPr>
-              <w:spacing w:after="0" w:line="252" w:lineRule="auto"/>
-            </w:pPr>
-            <w:r/>
-            <w:r>
-              <w:rPr>
-                <w:rFonts w:ascii="Aptos" w:hAnsi="Aptos"/>
-                <w:b w:val="0"/>
-                <w:color w:val="243B53"/>
-                <w:sz w:val="15"/>
-              </w:rPr>
-              <w:t>Dependencies use a single role value</w:t>
-            </w:r>
-          </w:p>
-        </w:tc>
-        <w:tc>
-          <w:tcPr>
-            <w:tcW w:type="dxa" w:w="2951"/>
-            <w:shd w:fill="FFFFFF"/>
-            <w:tcBorders>
-              <w:top w:val="single" w:sz="3" w:color="D9E2EC"/>
-              <w:left w:val="single" w:sz="3" w:color="D9E2EC"/>
-              <w:bottom w:val="single" w:sz="3" w:color="D9E2EC"/>
-              <w:right w:val="single" w:sz="3" w:color="D9E2EC"/>
-            </w:tcBorders>
-            <w:vAlign w:val="top"/>
-            <w:tcMar>
-              <w:top w:w="90" w:type="dxa"/>
-              <w:start w:w="100" w:type="dxa"/>
-              <w:bottom w:w="90" w:type="dxa"/>
-              <w:end w:w="100" w:type="dxa"/>
-            </w:tcMar>
-          </w:tcPr>
-          <w:p>
-            <w:pPr>
-              <w:spacing w:after="0" w:line="252" w:lineRule="auto"/>
-            </w:pPr>
-            <w:r/>
-            <w:r>
-              <w:rPr>
-                <w:rFonts w:ascii="Aptos" w:hAnsi="Aptos"/>
-                <w:b w:val="0"/>
-                <w:color w:val="243B53"/>
-                <w:sz w:val="15"/>
-              </w:rPr>
-              <w:t>A user with only admin role cannot automatically pass teacher dependency</w:t>
-            </w:r>
-          </w:p>
-        </w:tc>
-      </w:tr>
-      <w:tr>
-        <w:tc>
-          <w:tcPr>
-            <w:tcW w:type="dxa" w:w="1944"/>
-            <w:shd w:fill="F4F7FA"/>
-            <w:tcBorders>
-              <w:top w:val="single" w:sz="3" w:color="D9E2EC"/>
-              <w:left w:val="single" w:sz="3" w:color="D9E2EC"/>
-              <w:bottom w:val="single" w:sz="3" w:color="D9E2EC"/>
-              <w:right w:val="single" w:sz="3" w:color="D9E2EC"/>
-            </w:tcBorders>
-            <w:vAlign w:val="top"/>
-            <w:tcMar>
-              <w:top w:w="90" w:type="dxa"/>
-              <w:start w:w="100" w:type="dxa"/>
-              <w:bottom w:w="90" w:type="dxa"/>
-              <w:end w:w="100" w:type="dxa"/>
-            </w:tcMar>
-          </w:tcPr>
-          <w:p>
-            <w:pPr>
-              <w:spacing w:after="0" w:line="252" w:lineRule="auto"/>
-            </w:pPr>
-            <w:r/>
-            <w:r>
-              <w:rPr>
-                <w:rFonts w:ascii="Aptos" w:hAnsi="Aptos"/>
-                <w:b w:val="0"/>
-                <w:color w:val="243B53"/>
-                <w:sz w:val="15"/>
-              </w:rPr>
-              <w:t>Neo4j property warnings</w:t>
-            </w:r>
-          </w:p>
-        </w:tc>
-        <w:tc>
-          <w:tcPr>
-            <w:tcW w:type="dxa" w:w="4464"/>
-            <w:shd w:fill="F4F7FA"/>
-            <w:tcBorders>
-              <w:top w:val="single" w:sz="3" w:color="D9E2EC"/>
-              <w:left w:val="single" w:sz="3" w:color="D9E2EC"/>
-              <w:bottom w:val="single" w:sz="3" w:color="D9E2EC"/>
-              <w:right w:val="single" w:sz="3" w:color="D9E2EC"/>
-            </w:tcBorders>
-            <w:vAlign w:val="top"/>
-            <w:tcMar>
-              <w:top w:w="90" w:type="dxa"/>
-              <w:start w:w="100" w:type="dxa"/>
-              <w:bottom w:w="90" w:type="dxa"/>
-              <w:end w:w="100" w:type="dxa"/>
-            </w:tcMar>
-          </w:tcPr>
-          <w:p>
-            <w:pPr>
-              <w:spacing w:after="0" w:line="252" w:lineRule="auto"/>
-            </w:pPr>
-            <w:r/>
-            <w:r>
-              <w:rPr>
-                <w:rFonts w:ascii="Aptos" w:hAnsi="Aptos"/>
-                <w:b w:val="0"/>
-                <w:color w:val="243B53"/>
-                <w:sz w:val="15"/>
-              </w:rPr>
-              <w:t>Queries may reference optional properties not present on every node, such as logo</w:t>
-            </w:r>
-          </w:p>
-        </w:tc>
-        <w:tc>
-          <w:tcPr>
-            <w:tcW w:type="dxa" w:w="2951"/>
-            <w:shd w:fill="F4F7FA"/>
-            <w:tcBorders>
-              <w:top w:val="single" w:sz="3" w:color="D9E2EC"/>
-              <w:left w:val="single" w:sz="3" w:color="D9E2EC"/>
-              <w:bottom w:val="single" w:sz="3" w:color="D9E2EC"/>
-              <w:right w:val="single" w:sz="3" w:color="D9E2EC"/>
-            </w:tcBorders>
-            <w:vAlign w:val="top"/>
-            <w:tcMar>
-              <w:top w:w="90" w:type="dxa"/>
-              <w:start w:w="100" w:type="dxa"/>
-              <w:bottom w:w="90" w:type="dxa"/>
-              <w:end w:w="100" w:type="dxa"/>
-            </w:tcMar>
-          </w:tcPr>
-          <w:p>
-            <w:pPr>
-              <w:spacing w:after="0" w:line="252" w:lineRule="auto"/>
-            </w:pPr>
-            <w:r/>
-            <w:r>
-              <w:rPr>
-                <w:rFonts w:ascii="Aptos" w:hAnsi="Aptos"/>
-                <w:b w:val="0"/>
-                <w:color w:val="243B53"/>
-                <w:sz w:val="15"/>
-              </w:rPr>
-              <w:t>Warnings are usually non-fatal but schema cleanup is advisable</w:t>
-            </w:r>
-          </w:p>
-        </w:tc>
-      </w:tr>
-      <w:tr>
-        <w:tc>
-          <w:tcPr>
-            <w:tcW w:type="dxa" w:w="1944"/>
-            <w:shd w:fill="FFFFFF"/>
-            <w:tcBorders>
-              <w:top w:val="single" w:sz="3" w:color="D9E2EC"/>
-              <w:left w:val="single" w:sz="3" w:color="D9E2EC"/>
-              <w:bottom w:val="single" w:sz="3" w:color="D9E2EC"/>
-              <w:right w:val="single" w:sz="3" w:color="D9E2EC"/>
-            </w:tcBorders>
-            <w:vAlign w:val="top"/>
-            <w:tcMar>
-              <w:top w:w="90" w:type="dxa"/>
-              <w:start w:w="100" w:type="dxa"/>
-              <w:bottom w:w="90" w:type="dxa"/>
-              <w:end w:w="100" w:type="dxa"/>
-            </w:tcMar>
-          </w:tcPr>
-          <w:p>
-            <w:pPr>
-              <w:spacing w:after="0" w:line="252" w:lineRule="auto"/>
-            </w:pPr>
-            <w:r/>
-            <w:r>
-              <w:rPr>
-                <w:rFonts w:ascii="Aptos" w:hAnsi="Aptos"/>
-                <w:b w:val="0"/>
-                <w:color w:val="243B53"/>
-                <w:sz w:val="15"/>
-              </w:rPr>
               <w:t>Global tutor</w:t>
             </w:r>
           </w:p>
@@ -14391,7 +14086,7 @@
         <w:pStyle w:val="ListBullet"/>
       </w:pPr>
       <w:r>
-        <w:t>Add explicit OpenTelemetry spans around Neo4j reads/writes and cache layers so dependency time is separated from route time; also guard telemetry initialization so a malformed optional exporter cannot block application startup.</w:t>
+        <w:t>Keep explicit OpenTelemetry spans around Neo4j reads/writes and cache layers so dependency time is separated from route time; guard telemetry initialization so malformed optional exporter configuration cannot block startup, and preserve sanitized LLM error attributes.</w:t>
       </w:r>
     </w:p>
     <w:p>
@@ -14469,14 +14164,7 @@
               </w:rPr>
               <w:t>Source files</w:t>
               <w:br/>
-            </w:r>
-            <w:r>
-              <w:rPr>
-                <w:b w:val="0"/>
-                <w:color w:val="243B53"/>
-                <w:sz w:val="17"/>
-              </w:rPr>
-              <w:t>Primary implementation sources referenced by this document include backend/app/main.py, auth.py, config.py, database.py, observability.py, telemetry.py, assessment_observability.py, routers/curriculum.py, routers/test.py, routers/tutor.py, services/llm.py, services/generation_cache.py, services/assessment_attempts.py, services/semantic_clustering.py, services/clustering_runner.py, teacher_analytics.py, backend/.env.example, backend/tests/test_telemetry.py, backend/tests/test_assessment_observability.py, backend/tests/test_production_assessment_flow.py, and backend/tests/test_assessment_context.py. Unrelated evaluation, export, and promotion scripts are not used as behavioral evidence in this revision.</w:t>
+              <w:t>Primary sources include backend/app/{main,auth,config,database,observability,telemetry,assessment_observability}.py; routers/{curriculum,test,insights,tutor}.py; services/{llm,generation_cache,assessment_execution,learner_evidence,assessment_attempts,semantic_clustering,clustering_runner}.py; teacher_analytics.py; and focused tests under backend/tests/.</w:t>
             </w:r>
           </w:p>
         </w:tc>

</xml_diff>